<commit_message>
Update part 1 report with GitHub repository details
</commit_message>
<xml_diff>
--- a/reports/ТРПП_итоговый_проект_часть_1_Магомедова_Багирян.docx
+++ b/reports/ТРПП_итоговый_проект_часть_1_Магомедова_Багирян.docx
@@ -105,12 +105,17 @@
     </w:p>
     <w:p>
       <w:r>
-        <w:t xml:space="preserve">Для ведения проекта используется система контроля версий Git. В рабочей папке уже создан локальный Git-репозиторий проекта. На момент подготовки отчета удаленный репозиторий в текущем окружении еще не подключен.</w:t>
+        <w:t xml:space="preserve">Для итогового проекта создан отдельный локальный Git-репозиторий внутри папки final_db_project, после чего был создан и подключен удаленный репозиторий на GitHub.</w:t>
       </w:r>
     </w:p>
     <w:p>
       <w:r>
-        <w:t xml:space="preserve">Рекомендуемые команды для подключения удаленного репозитория: git remote add origin &lt;ссылка_на_удаленный_репозиторий&gt;; git branch -M main; git push -u origin main.</w:t>
+        <w:t xml:space="preserve">Ссылка на удаленный репозиторий: https://github.com/mgvlla/trpp-final-ticketing-db</w:t>
+      </w:r>
+    </w:p>
+    <w:p>
+      <w:r>
+        <w:t xml:space="preserve">Основная ветка проекта переименована в main и опубликована на GitHub. Для совместной работы второму участнику необходимо выдать доступ к этому репозиторию через настройки GitHub.</w:t>
       </w:r>
     </w:p>
     <w:p>
@@ -130,7 +135,7 @@
     </w:p>
     <w:p>
       <w:r>
-        <w:t xml:space="preserve">В первой части итогового проекта выполнены все стартовые этапы: выбрана тема разработки, определен состав команды, сформулированы функциональные требования в формате User Story, подготовлен макет интерфейса, выбран способ ведения репозитория и зафиксированы правила начала разработки.</w:t>
+        <w:t xml:space="preserve">В первой части итогового проекта выполнены все стартовые этапы: выбрана тема разработки, определен состав команды, сформулированы функциональные требования в формате User Story, подготовлен макет интерфейса, создан и опубликован удаленный репозиторий, а также зафиксированы правила начала разработки.</w:t>
       </w:r>
     </w:p>
     <w:sectPr>

</xml_diff>